<commit_message>
site: soften capital-markets dialogue bullet in 5 canonical resumes (DOCX + PDF)
Replaces named-counterparty phrasing ("dialogues with Circle and Ubyx") with operator-class phrasing ("Working dialogue with capital-markets infrastructure operators"); asset-class scope expanded to stablecoin, deposit-token, tokenized-deposit, and tokenized-equity deployment.

Matches workflow-clone commit 03e21249 (CryptoZach/Claude1).

Co-Authored-By: Claude Opus 4.7 (1M context) <noreply@anthropic.com>
</commit_message>
<xml_diff>
--- a/resumes/Zukowski_Resume_Operator.docx
+++ b/resumes/Zukowski_Resume_Operator.docx
@@ -153,7 +153,7 @@
           <w:sz w:val="19"/>
           <w:szCs w:val="19"/>
         </w:rPr>
-        <w:t>Stablecoin and tokenization product strategist. Founding research hire at Borderless Capital (RIA, Dec 2019 to Feb 2026): sourced the LayerZero seed round (~80x return; thesis preceded the firm's Cross-Chain Ecosystem Fund by two years); predicted Thorchain's $200M insolvency 13 months in advance via 10-step scenario modeling (Dec 2023 internal memo; failure materialized in Jan 2025), underwriting the firm's no-exposure position. Now founder of Tokenization Systems (Feb 2026 to present), an independent research and partner-engagement program. Authored an eight-paper SSRN research program: Control Layer Intensity Index (CLII) for gateway concentration; Minimum Viable Equivalence Pack (MVEP) for institutional tokenization diligence; programmable monetary-policy design (Adaptive Tokenomics); governance concentration; operational risk in token economies. Contributed eight comment letters across federal regulatory dockets (OCC bank stablecoin engagement; Treasury GENIUS Act state similarity; FDIC payment-stablecoin reserves and subsidiary issuance; FinCEN AML/CFT and PPSI sanctions; joint banking AML/CFT). Capital-markets infrastructure dialogues with Circle and Ubyx on stablecoin and deposit-token deployment.</w:t>
+        <w:t>Stablecoin and tokenization product strategist. Founding research hire at Borderless Capital (RIA, Dec 2019 to Feb 2026): sourced the LayerZero seed round (~80x return; thesis preceded the firm's Cross-Chain Ecosystem Fund by two years); predicted Thorchain's $200M insolvency 13 months in advance via 10-step scenario modeling (Dec 2023 internal memo; failure materialized in Jan 2025), underwriting the firm's no-exposure position. Now founder of Tokenization Systems (Feb 2026 to present), an independent research and partner-engagement program. Authored an eight-paper SSRN research program: Control Layer Intensity Index (CLII) for gateway concentration; Minimum Viable Equivalence Pack (MVEP) for institutional tokenization diligence; programmable monetary-policy design (Adaptive Tokenomics); governance concentration; operational risk in token economies. Contributed eight comment letters across federal regulatory dockets (OCC bank stablecoin engagement; Treasury GENIUS Act state similarity; FDIC payment-stablecoin reserves and subsidiary issuance; FinCEN AML/CFT and PPSI sanctions; joint banking AML/CFT). Working dialogue with capital-markets infrastructure operators on stablecoin, deposit-token, tokenized-deposit, and tokenized-equity deployment.</w:t>
       </w:r>
     </w:p>
     <w:p>
@@ -393,7 +393,7 @@
         <w:ind w:left="320" w:hanging="160"/>
       </w:pPr>
       <w:r>
-        <w:t>• Capital-markets infrastructure dialogues with Circle and Ubyx on stablecoin and deposit-token deployment.</w:t>
+        <w:t>• Working dialogue with capital-markets infrastructure operators on stablecoin, deposit-token, tokenized-deposit, and tokenized-equity deployment.</w:t>
       </w:r>
     </w:p>
     <w:p>

</xml_diff>